<commit_message>
fix(qa): include ERROR_NOT_FOUND to detect completely fake DOIs in architecture tests
</commit_message>
<xml_diff>
--- a/docs/vaults/u1-aa-01-applied-econometrics/ape2-crisis-iess/templates/custom-reference.docx
+++ b/docs/vaults/u1-aa-01-applied-econometrics/ape2-crisis-iess/templates/custom-reference.docx
@@ -482,7 +482,7 @@
 </file>
 
 <file path=word/styles.xml><?xml version="1.0" encoding="utf-8"?>
-<w:styles xmlns:r="http://schemas.openxmlformats.org/officeDocument/2006/relationships" xmlns:w="http://schemas.openxmlformats.org/wordprocessingml/2006/main">
+<w:styles xmlns:w="http://schemas.openxmlformats.org/wordprocessingml/2006/main">
   <w:docDefaults>
     <w:rPrDefault>
       <w:rPr>
@@ -504,6 +504,7 @@
     <w:qFormat/>
     <w:pPr>
       <w:jc w:val="both"/>
+      <w:ind w:left="0" w:right="0" w:firstLine="0" w:hanging="0"/>
     </w:pPr>
     <w:rPr>
       <w:rFonts w:ascii="Times New Roman" w:hAnsi="Times New Roman" w:eastAsia="Times New Roman" w:cs="Times New Roman"/>
@@ -519,6 +520,7 @@
     <w:pPr>
       <w:spacing w:before="180" w:after="180"/>
       <w:jc w:val="both"/>
+      <w:ind w:left="0" w:right="0" w:firstLine="0" w:hanging="0"/>
     </w:pPr>
     <w:rPr>
       <w:rFonts w:ascii="Times New Roman" w:hAnsi="Times New Roman" w:eastAsia="Times New Roman" w:cs="Times New Roman"/>
@@ -533,6 +535,7 @@
     <w:qFormat/>
     <w:pPr>
       <w:jc w:val="both"/>
+      <w:ind w:left="0" w:right="0" w:firstLine="0" w:hanging="0"/>
     </w:pPr>
     <w:rPr>
       <w:rFonts w:ascii="Times New Roman" w:hAnsi="Times New Roman" w:eastAsia="Times New Roman" w:cs="Times New Roman"/>
@@ -546,6 +549,7 @@
     <w:qFormat/>
     <w:pPr>
       <w:spacing w:before="36" w:after="36"/>
+      <w:ind w:left="0" w:right="0" w:firstLine="0" w:hanging="0"/>
     </w:pPr>
     <w:rPr>
       <w:rFonts w:ascii="Times New Roman" w:hAnsi="Times New Roman" w:eastAsia="Times New Roman" w:cs="Times New Roman"/>

</xml_diff>